<commit_message>
docs(proposal): add matchmaking state machine, benchmark protocol and accessibility sections
- §2.3 state machine, disconnect handling and capacity limits
- §3.3 quantitative latency, load and soak benchmark protocol
- §4.3 accessibility commitments under WCAG 2.1 AA
- log the change and the open consistency gaps in WORKLOG.md
</commit_message>
<xml_diff>
--- a/docs/proposal/AILT9019_Revised_Proposal_G31.docx
+++ b/docs/proposal/AILT9019_Revised_Proposal_G31.docx
@@ -562,6 +562,52 @@
       </w:r>
     </w:p>
     <w:p>
+      <w:r>
+        <w:rPr>
+          <w:b/>
+          <w:color w:val="1F3B73"/>
+          <w:sz w:val="23"/>
+        </w:rPr>
+        <w:t>2.3 Matchmaking State Machine, Disconnect Handling and Capacity Limits</w:t>
+      </w:r>
+    </w:p>
+    <w:p>
+      <w:pPr>
+        <w:spacing w:after="120"/>
+        <w:jc w:val="both"/>
+      </w:pPr>
+      <w:r>
+        <w:t>Every session moves through one server-owned state machine, and the browser only ever renders the state the server reports. The four states are IDLE → QUEUED → IN_MATCH → CLOSED. The QUEUED → IN_MATCH transition is decided inside a single matchmaking tick that runs every 500 ms; the browser cannot promote itself into a match, and it cannot see another player's identity or age until a room has actually been created.</w:t>
+      </w:r>
+    </w:p>
+    <w:p>
+      <w:pPr>
+        <w:spacing w:after="120"/>
+        <w:jc w:val="both"/>
+      </w:pPr>
+      <w:r>
+        <w:t>Each tick performs three steps in order: (1) it scans the FIFO pool for the earliest compatible pair whose age difference is within three years and atomically removes both entries; (2) it evicts any entry whose queue age has reached 15 seconds and routes that user into a PvE room; (3) it broadcasts a queue_status frame carrying elapsed_seconds and timeout_seconds, so the on-screen countdown is server-sourced rather than client-invented. Because matching and expiry happen in the same pass, a user can never be matched after already being routed to an AI opponent.</w:t>
+      </w:r>
+    </w:p>
+    <w:p>
+      <w:pPr>
+        <w:spacing w:after="120"/>
+        <w:jc w:val="both"/>
+      </w:pPr>
+      <w:r>
+        <w:t>Disconnection is treated as a first-class event rather than an exception. When a socket closes, the session is removed from the queue and from its room; the surviving player immediately receives an opponent_disconnected frame, the room is destroyed with its board state, and the end-game modal offers two explicit choices — re-queue for a human peer, or continue against the AI. No room can therefore outlive its last human socket, and no orphaned room can accumulate in memory across a long-running deployment.</w:t>
+      </w:r>
+    </w:p>
+    <w:p>
+      <w:pPr>
+        <w:spacing w:after="120"/>
+        <w:jc w:val="both"/>
+      </w:pPr>
+      <w:r>
+        <w:t>The 30-second turn timer is likewise enforced on the server, not in the client: a turn that exceeds the cap is forfeited, so an idle or vanished client can never freeze the opponent's match. On the capacity side, the deployment runs a single Uvicorn worker precisely so that the queue and the room table cannot diverge across processes. Each room costs a 7×6 integer board plus a handful of small fields — under 2 KB — and the queue is capped at a configurable maximum (200 by default); beyond that the server answers queue_full with a retry-after hint instead of silently accepting work it cannot serve. If horizontal scaling is ever required, the state machine is the component that would move to a shared store; the client protocol would not change.</w:t>
+      </w:r>
+    </w:p>
+    <w:p>
       <w:pPr>
         <w:pStyle w:val="Heading1"/>
       </w:pPr>
@@ -934,6 +980,367 @@
       </w:r>
     </w:p>
     <w:p>
+      <w:r>
+        <w:rPr>
+          <w:b/>
+          <w:color w:val="1F3B73"/>
+          <w:sz w:val="23"/>
+        </w:rPr>
+        <w:t>3.3 Quantitative Latency, Load and Reliability Benchmarks</w:t>
+      </w:r>
+    </w:p>
+    <w:p>
+      <w:pPr>
+        <w:spacing w:after="120"/>
+        <w:jc w:val="both"/>
+      </w:pPr>
+      <w:r>
+        <w:t>The two suites above establish functional correctness; this third protocol establishes that the prototype stays usable under real network and concurrency conditions. It separates transport cost from AI cost by running the same scripted 20-move game twice: Phase 1 with the AI disabled (engine and WebSocket only) and Phase 2 with GLM enabled, so that a slow opponent can be attributed to the provider rather than to the room manager.</w:t>
+      </w:r>
+    </w:p>
+    <w:tbl>
+      <w:tblPr>
+        <w:tblStyle w:val="TableGrid"/>
+        <w:tblW w:type="auto" w:w="0"/>
+        <w:jc w:val="center"/>
+        <w:tblLook w:firstColumn="1" w:firstRow="1" w:lastColumn="0" w:lastRow="0" w:noHBand="0" w:noVBand="1" w:val="04A0"/>
+      </w:tblPr>
+      <w:tblGrid>
+        <w:gridCol w:w="3168"/>
+        <w:gridCol w:w="3168"/>
+        <w:gridCol w:w="3168"/>
+      </w:tblGrid>
+      <w:tr>
+        <w:tc>
+          <w:tcPr>
+            <w:tcW w:type="dxa" w:w="3168"/>
+          </w:tcPr>
+          <w:p>
+            <w:r/>
+            <w:r>
+              <w:rPr>
+                <w:b/>
+                <w:sz w:val="19"/>
+              </w:rPr>
+              <w:t>Metric</w:t>
+            </w:r>
+          </w:p>
+        </w:tc>
+        <w:tc>
+          <w:tcPr>
+            <w:tcW w:type="dxa" w:w="3168"/>
+          </w:tcPr>
+          <w:p>
+            <w:r/>
+            <w:r>
+              <w:rPr>
+                <w:b/>
+                <w:sz w:val="19"/>
+              </w:rPr>
+              <w:t>How it is measured</w:t>
+            </w:r>
+          </w:p>
+        </w:tc>
+        <w:tc>
+          <w:tcPr>
+            <w:tcW w:type="dxa" w:w="3168"/>
+          </w:tcPr>
+          <w:p>
+            <w:r/>
+            <w:r>
+              <w:rPr>
+                <w:b/>
+                <w:sz w:val="19"/>
+              </w:rPr>
+              <w:t>Pass bar</w:t>
+            </w:r>
+          </w:p>
+        </w:tc>
+      </w:tr>
+      <w:tr>
+        <w:tc>
+          <w:tcPr>
+            <w:tcW w:type="dxa" w:w="3168"/>
+          </w:tcPr>
+          <w:p>
+            <w:r/>
+            <w:r>
+              <w:rPr>
+                <w:sz w:val="19"/>
+              </w:rPr>
+              <w:t>WebSocket hop latency</w:t>
+            </w:r>
+          </w:p>
+        </w:tc>
+        <w:tc>
+          <w:tcPr>
+            <w:tcW w:type="dxa" w:w="3168"/>
+          </w:tcPr>
+          <w:p>
+            <w:r/>
+            <w:r>
+              <w:rPr>
+                <w:sz w:val="19"/>
+              </w:rPr>
+              <w:t>Client timestamp before send vs. server receipt, and the mirrored echo, over 200 frames</w:t>
+            </w:r>
+          </w:p>
+        </w:tc>
+        <w:tc>
+          <w:tcPr>
+            <w:tcW w:type="dxa" w:w="3168"/>
+          </w:tcPr>
+          <w:p>
+            <w:r/>
+            <w:r>
+              <w:rPr>
+                <w:sz w:val="19"/>
+              </w:rPr>
+              <w:t>p95 ≤ 150 ms</w:t>
+            </w:r>
+          </w:p>
+        </w:tc>
+      </w:tr>
+      <w:tr>
+        <w:tc>
+          <w:tcPr>
+            <w:tcW w:type="dxa" w:w="3168"/>
+          </w:tcPr>
+          <w:p>
+            <w:r/>
+            <w:r>
+              <w:rPr>
+                <w:sz w:val="19"/>
+              </w:rPr>
+              <w:t>AI move latency</w:t>
+            </w:r>
+          </w:p>
+        </w:tc>
+        <w:tc>
+          <w:tcPr>
+            <w:tcW w:type="dxa" w:w="3168"/>
+          </w:tcPr>
+          <w:p>
+            <w:r/>
+            <w:r>
+              <w:rPr>
+                <w:sz w:val="19"/>
+              </w:rPr>
+              <w:t>Server-side timer around the GLM call, 50 consecutive PvE moves</w:t>
+            </w:r>
+          </w:p>
+        </w:tc>
+        <w:tc>
+          <w:tcPr>
+            <w:tcW w:type="dxa" w:w="3168"/>
+          </w:tcPr>
+          <w:p>
+            <w:r/>
+            <w:r>
+              <w:rPr>
+                <w:sz w:val="19"/>
+              </w:rPr>
+              <w:t>p95 ≤ 3.5 s (pilot readings: 2.3–2.9 s)</w:t>
+            </w:r>
+          </w:p>
+        </w:tc>
+      </w:tr>
+      <w:tr>
+        <w:tc>
+          <w:tcPr>
+            <w:tcW w:type="dxa" w:w="3168"/>
+          </w:tcPr>
+          <w:p>
+            <w:r/>
+            <w:r>
+              <w:rPr>
+                <w:sz w:val="19"/>
+              </w:rPr>
+              <w:t>Fallback activation</w:t>
+            </w:r>
+          </w:p>
+        </w:tc>
+        <w:tc>
+          <w:tcPr>
+            <w:tcW w:type="dxa" w:w="3168"/>
+          </w:tcPr>
+          <w:p>
+            <w:r/>
+            <w:r>
+              <w:rPr>
+                <w:sz w:val="19"/>
+              </w:rPr>
+              <w:t>Fault injection (Test Suite B) with the clock started at the error response</w:t>
+            </w:r>
+          </w:p>
+        </w:tc>
+        <w:tc>
+          <w:tcPr>
+            <w:tcW w:type="dxa" w:w="3168"/>
+          </w:tcPr>
+          <w:p>
+            <w:r/>
+            <w:r>
+              <w:rPr>
+                <w:sz w:val="19"/>
+              </w:rPr>
+              <w:t>≤ 1.5 s, room never disconnects</w:t>
+            </w:r>
+          </w:p>
+        </w:tc>
+      </w:tr>
+      <w:tr>
+        <w:tc>
+          <w:tcPr>
+            <w:tcW w:type="dxa" w:w="3168"/>
+          </w:tcPr>
+          <w:p>
+            <w:r/>
+            <w:r>
+              <w:rPr>
+                <w:sz w:val="19"/>
+              </w:rPr>
+              <w:t>Queue pairing latency</w:t>
+            </w:r>
+          </w:p>
+        </w:tc>
+        <w:tc>
+          <w:tcPr>
+            <w:tcW w:type="dxa" w:w="3168"/>
+          </w:tcPr>
+          <w:p>
+            <w:r/>
+            <w:r>
+              <w:rPr>
+                <w:sz w:val="19"/>
+              </w:rPr>
+              <w:t>Time from the second queue_join to match_found for a compatible pair</w:t>
+            </w:r>
+          </w:p>
+        </w:tc>
+        <w:tc>
+          <w:tcPr>
+            <w:tcW w:type="dxa" w:w="3168"/>
+          </w:tcPr>
+          <w:p>
+            <w:r/>
+            <w:r>
+              <w:rPr>
+                <w:sz w:val="19"/>
+              </w:rPr>
+              <w:t>p95 ≤ 1.0 s (tick is 500 ms)</w:t>
+            </w:r>
+          </w:p>
+        </w:tc>
+      </w:tr>
+      <w:tr>
+        <w:tc>
+          <w:tcPr>
+            <w:tcW w:type="dxa" w:w="3168"/>
+          </w:tcPr>
+          <w:p>
+            <w:r/>
+            <w:r>
+              <w:rPr>
+                <w:sz w:val="19"/>
+              </w:rPr>
+              <w:t>Concurrent load</w:t>
+            </w:r>
+          </w:p>
+        </w:tc>
+        <w:tc>
+          <w:tcPr>
+            <w:tcW w:type="dxa" w:w="3168"/>
+          </w:tcPr>
+          <w:p>
+            <w:r/>
+            <w:r>
+              <w:rPr>
+                <w:sz w:val="19"/>
+              </w:rPr>
+              <w:t>40 simulated sockets in 20 rooms replaying scripted games for 10 minutes</w:t>
+            </w:r>
+          </w:p>
+        </w:tc>
+        <w:tc>
+          <w:tcPr>
+            <w:tcW w:type="dxa" w:w="3168"/>
+          </w:tcPr>
+          <w:p>
+            <w:r/>
+            <w:r>
+              <w:rPr>
+                <w:sz w:val="19"/>
+              </w:rPr>
+              <w:t>RSS &lt; 50 MB, 0 stalled rooms</w:t>
+            </w:r>
+          </w:p>
+        </w:tc>
+      </w:tr>
+      <w:tr>
+        <w:tc>
+          <w:tcPr>
+            <w:tcW w:type="dxa" w:w="3168"/>
+          </w:tcPr>
+          <w:p>
+            <w:r/>
+            <w:r>
+              <w:rPr>
+                <w:sz w:val="19"/>
+              </w:rPr>
+              <w:t>Soak stability</w:t>
+            </w:r>
+          </w:p>
+        </w:tc>
+        <w:tc>
+          <w:tcPr>
+            <w:tcW w:type="dxa" w:w="3168"/>
+          </w:tcPr>
+          <w:p>
+            <w:r/>
+            <w:r>
+              <w:rPr>
+                <w:sz w:val="19"/>
+              </w:rPr>
+              <w:t>100 completed matches back-to-back</w:t>
+            </w:r>
+          </w:p>
+        </w:tc>
+        <w:tc>
+          <w:tcPr>
+            <w:tcW w:type="dxa" w:w="3168"/>
+          </w:tcPr>
+          <w:p>
+            <w:r/>
+            <w:r>
+              <w:rPr>
+                <w:sz w:val="19"/>
+              </w:rPr>
+              <w:t>0 unhandled exceptions, 0 leaked rooms</w:t>
+            </w:r>
+          </w:p>
+        </w:tc>
+      </w:tr>
+    </w:tbl>
+    <w:p>
+      <w:pPr>
+        <w:spacing w:after="120"/>
+        <w:jc w:val="both"/>
+      </w:pPr>
+      <w:r>
+        <w:t>The harness is a headless Python websockets client that opens N sockets, replays a fixed move script, and records four timestamps per event (client send, server receipt, server send, client receive). Each configuration is run three times; we report the median and the 95th percentile rather than a single best case, and the raw CSV is committed under docs/eval/ so that any reviewer can re-derive the numbers instead of trusting a summary table. Memory is sampled once per second from the server process's resident set size.</w:t>
+      </w:r>
+    </w:p>
+    <w:p>
+      <w:pPr>
+        <w:spacing w:after="120"/>
+        <w:jc w:val="both"/>
+      </w:pPr>
+      <w:r>
+        <w:t>These thresholds are deliberately tighter than the user-visible experience requires: a 150 ms hop keeps the board feeling synchronous on a Hong Kong mobile connection, and a 3.5 s AI deadline matches the hard timeout already enforced in code, so a benchmark failure and a production stall are the same event rather than two different ones.</w:t>
+      </w:r>
+    </w:p>
+    <w:p>
       <w:pPr>
         <w:pStyle w:val="Heading1"/>
       </w:pPr>
@@ -1107,6 +1514,119 @@
           <w:sz w:val="20"/>
         </w:rPr>
         <w:t>This project is conceived and packaged strictly as an interactive web mini-game; exporting reusable skill modules or tool manifests for other agent platforms (such as Pi Agent or desktop agent harnesses) is explicitly out of scope for this semester's prototype.</w:t>
+      </w:r>
+    </w:p>
+    <w:p>
+      <w:r>
+        <w:rPr>
+          <w:b/>
+          <w:color w:val="1F3B73"/>
+          <w:sz w:val="23"/>
+        </w:rPr>
+        <w:t>4.3 Accessibility and Inclusive Access</w:t>
+      </w:r>
+    </w:p>
+    <w:p>
+      <w:pPr>
+        <w:spacing w:after="120"/>
+        <w:jc w:val="both"/>
+      </w:pPr>
+      <w:r>
+        <w:t>Because the board is drawn on a Canvas element, accessibility cannot be inherited from the DOM — it has to be designed in. We target WCAG 2.1 Level AA for everything the game can control:</w:t>
+      </w:r>
+    </w:p>
+    <w:p>
+      <w:pPr>
+        <w:spacing w:after="120"/>
+        <w:ind w:left="360"/>
+        <w:jc w:val="both"/>
+      </w:pPr>
+      <w:r>
+        <w:t xml:space="preserve">• </w:t>
+      </w:r>
+      <w:r>
+        <w:rPr>
+          <w:b/>
+        </w:rPr>
+        <w:t xml:space="preserve">Perceivable. </w:t>
+      </w:r>
+      <w:r>
+        <w:t>Body text meets a 4.5:1 contrast ratio and interactive borders 3:1. Red and yellow tokens are never distinguished by hue alone: each carries a distinct ring treatment and a P1/P2 glyph, so the board stays readable for deuteranopic users and in greyscale. The full board state is mirrored into a visually hidden HTML table addressed by row and column, and each move is announced through an aria-live region (“Red plays column 4. Yellow's turn.”).</w:t>
+      </w:r>
+    </w:p>
+    <w:p>
+      <w:pPr>
+        <w:spacing w:after="120"/>
+        <w:ind w:left="360"/>
+        <w:jc w:val="both"/>
+      </w:pPr>
+      <w:r>
+        <w:t xml:space="preserve">• </w:t>
+      </w:r>
+      <w:r>
+        <w:rPr>
+          <w:b/>
+        </w:rPr>
+        <w:t xml:space="preserve">Operable. </w:t>
+      </w:r>
+      <w:r>
+        <w:t>The entire match is playable from the keyboard: Tab reaches the board, the arrow keys move a column cursor, Space or Enter drops a token, Tab reaches the phrase tray, and Escape closes any modal. Focus is always visible. Nothing is drag-only, touch targets are at least 44×44 px, and the layout holds at a 320 px viewport.</w:t>
+      </w:r>
+    </w:p>
+    <w:p>
+      <w:pPr>
+        <w:spacing w:after="120"/>
+        <w:ind w:left="360"/>
+        <w:jc w:val="both"/>
+      </w:pPr>
+      <w:r>
+        <w:t xml:space="preserve">• </w:t>
+      </w:r>
+      <w:r>
+        <w:rPr>
+          <w:b/>
+        </w:rPr>
+        <w:t xml:space="preserve">Understandable. </w:t>
+      </w:r>
+      <w:r>
+        <w:t>Labels are plain-language and consistent, validation messages appear next to the field that caused them, and no status is communicated by colour alone.</w:t>
+      </w:r>
+    </w:p>
+    <w:p>
+      <w:pPr>
+        <w:spacing w:after="120"/>
+        <w:ind w:left="360"/>
+        <w:jc w:val="both"/>
+      </w:pPr>
+      <w:r>
+        <w:t xml:space="preserve">• </w:t>
+      </w:r>
+      <w:r>
+        <w:rPr>
+          <w:b/>
+        </w:rPr>
+        <w:t xml:space="preserve">Robust. </w:t>
+      </w:r>
+      <w:r>
+        <w:t>Registration, the phrase tray and the result modal are semantic HTML with real buttons and labels; the canvas carries an accessible name and a text alternative that mirrors the grid.</w:t>
+      </w:r>
+    </w:p>
+    <w:p>
+      <w:pPr>
+        <w:spacing w:after="120"/>
+        <w:jc w:val="both"/>
+      </w:pPr>
+      <w:r>
+        <w:t>Two timing decisions follow from the same principle. Honouring prefers-reduced-motion removes the token bounce and the win confetti without removing any information. More importantly, the 30-second turn timer is a genuine barrier for users with motor or cognitive impairments, so the match configures a 60-second timer with a warning at 10 seconds remaining, and no match can be lost to a mis-click in its first three seconds.</w:t>
+      </w:r>
+    </w:p>
+    <w:p>
+      <w:pPr>
+        <w:spacing w:after="120"/>
+        <w:jc w:val="both"/>
+      </w:pPr>
+      <w:r>
+        <w:t>Verification is part of the evaluation, not a promise: a keyboard-only walkthrough of the full journey, a screen-reader pass with VoiceOver on macOS and NVDA on Windows, an axe DevTools scan with zero critical issues, and at least two participants in the 15-person cohort who routinely use assistive settings.</w:t>
       </w:r>
     </w:p>
     <w:p>

</xml_diff>